<commit_message>
añade respuestas a preguntas
</commit_message>
<xml_diff>
--- a/informe/informe.docx
+++ b/informe/informe.docx
@@ -560,7 +560,7 @@
           <w:color w:val="000000"/>
           <w:sz w:val="24"/>
         </w:rPr>
-        <w:t>Los escenarios A, B y C se simulan durante 300 minutos con el modelo de Euler. B y C aplican la perturbación solo entre los minutos 60 y 180, de modo que se ve tanto la reacción como la recuperación (Figura 4). La Tabla 1 reúne las métricas (resultados/tablas/metricas_escenarios.csv, generada por escenarios.py).</w:t>
+        <w:t>Los escenarios A, B y C se simulan durante 300 minutos con el modelo de Euler. B y C aplican la perturbación solo entre los minutos 60 y 180, de modo que se ve tanto la reacción como la recuperación (Figura 4). La Tabla 1 reúne las métricas (resultados/tablas/metricas_escenarios.csv, generada por integracion/escenarios.py).</w:t>
       </w:r>
     </w:p>
     <w:p>
@@ -2136,7 +2136,7 @@
           <w:color w:val="000000"/>
           <w:sz w:val="24"/>
         </w:rPr>
-        <w:t>El Escenario E usa datos/procesado/escenario_e.csv: 1.351 intervalos de cinco minutos entre el lunes 26 de octubre y el domingo 1 de noviembre de 2026, de 06:00 a 22:00, en una ruta fija. Los datos son sintéticos (sección 4). El análisis está en escenario_e.py.</w:t>
+        <w:t>El Escenario E usa datos/procesado/escenario_e.csv: 1.351 intervalos de cinco minutos entre el lunes 26 de octubre y el domingo 1 de noviembre de 2026, de 06:00 a 22:00, en una ruta fija. Los datos son sintéticos (sección 4). El análisis está en integracion/escenario_e.py.</w:t>
       </w:r>
     </w:p>
     <w:p>
@@ -4728,7 +4728,7 @@
           <w:color w:val="000000"/>
           <w:sz w:val="24"/>
         </w:rPr>
-        <w:t>Los valores calibrados (Tabla 6, resultados/tablas/E_calibracion_traduccion.csv) son el promedio de D0_hat y S0_hat dentro de cada categoría y se aplicaron como constantes en capa2_bayes/traduccion.py, con un comentario que cita datos/README.md. Se compararon con los valores orientativos del README de datos (D0 = 50/62/75, S0 = 38/44/48): con ellos, el precio de equilibrio que predice la red difiere del precio medio observado en 3,1 Bs (error cuadrático medio ponderado), frente a 1,2 Bs con los promedios por categoría. Los valores anteriores (D0 alta = 100, S0 baja = 30) venían de los escenarios B y C del documento. Esos escenarios son choques más fuertes que cualquier contexto de los datos (D0_hat no supera 90 y S0_hat no baja de 34), por lo que B y C se siguen definiendo directamente en params.py y no a partir de la tabla de traducción.</w:t>
+        <w:t>Los valores calibrados (Tabla 6, resultados/tablas/E_calibracion_traduccion.csv) son el promedio de D0_hat y S0_hat dentro de cada categoría y se aplicaron como constantes en capa2_bayes/traduccion.py, con un comentario que cita datos/README.md. Se compararon con los valores orientativos del README de datos (D0 = 50/62/75, S0 = 38/44/48): con ellos, el precio de equilibrio que predice la red difiere del precio medio observado en 3,1 Bs (error cuadrático medio ponderado), frente a 1,2 Bs con los promedios por categoría. Los valores anteriores (D0 alta = 100, S0 baja = 30) venían de los escenarios B y C del documento. Esos escenarios son choques más fuertes que cualquier contexto de los datos (D0_hat no supera 90 y S0_hat no baja de 34), por lo que B y C se siguen definiendo directamente en integracion/params.py y no a partir de la tabla de traducción.</w:t>
       </w:r>
     </w:p>
     <w:p>
@@ -6607,7 +6607,7 @@
           <w:color w:val="000000"/>
           <w:sz w:val="24"/>
         </w:rPr>
-        <w:t>Para llevar la incertidumbre del contexto al precio, montecarlo.py toma 500 pares (D0, S0) de P(Demanda, Oferta | contexto) con muestrear_parametros() y corre simular() con cada uno. La Figura 8 muestra la mediana y los percentiles 5 y 95 del precio (resultados/tablas/montecarlo_bandas.csv) y la Tabla 9 el resumen (resultados/tablas/montecarlo_resumen.csv).</w:t>
+        <w:t>Para llevar la incertidumbre del contexto al precio, integracion/montecarlo.py toma 500 pares (D0, S0) de P(Demanda, Oferta | contexto) con muestrear_parametros() y corre simular() con cada uno. La Figura 8 muestra la mediana y los percentiles 5 y 95 del precio (resultados/tablas/montecarlo_bandas.csv) y la Tabla 9 el resumen (resultados/tablas/montecarlo_resumen.csv).</w:t>
       </w:r>
     </w:p>
     <w:p>
@@ -8595,7 +8595,7 @@
           <w:color w:val="000000"/>
           <w:sz w:val="24"/>
         </w:rPr>
-        <w:t>En cada intervalo: si P(escasez) &gt; X y el límite inferior del precio estimado supera Y, se incentiva a los conductores; si P(escasez) &gt; X y el límite inferior no supera Y, se sube el precio; en otro caso se mantiene. Los valores elegidos son X = 0,30 e Y = 13 Bs. El límite inferior es la estimación de Kalman menos dos desviaciones. Se usa en lugar de la estimación puntual para que la afirmación «el precio ya supera Y» tenga 97,5 % de confianza: solo se renuncia a subir el precio, y se paga un bono, cuando es casi seguro que el precio ya es alto. Además, cada acción se mantiene al menos 30 minutos antes de cambiar (sección 6.3). La regla está en decision.py.</w:t>
+        <w:t>En cada intervalo: si P(escasez) &gt; X y el límite inferior del precio estimado supera Y, se incentiva a los conductores; si P(escasez) &gt; X y el límite inferior no supera Y, se sube el precio; en otro caso se mantiene. Los valores elegidos son X = 0,30 e Y = 13 Bs. El límite inferior es la estimación de Kalman menos dos desviaciones. Se usa en lugar de la estimación puntual para que la afirmación «el precio ya supera Y» tenga 97,5 % de confianza: solo se renuncia a subir el precio, y se paga un bono, cuando es casi seguro que el precio ya es alto. Además, cada acción se mantiene al menos 30 minutos antes de cambiar (sección 6.3). La regla está en integracion/decision.py.</w:t>
       </w:r>
     </w:p>
     <w:p>
@@ -10968,7 +10968,7 @@
           <w:color w:val="000000"/>
           <w:sz w:val="24"/>
         </w:rPr>
-        <w:t>El documento del caso plantea siete preguntas abiertas. Esta sección responde cada una con los resultados del sistema; las que ya se trataron en secciones anteriores se resumen y se indica dónde está el detalle.</w:t>
+        <w:t>El documento del caso plantea siete preguntas abiertas. Esta sección responde cada una con los resultados del sistema; las que ya se trataron en secciones anteriores se resumen y se indica dónde está el detalle. Un resumen de las siete respuestas, con enlaces a sus tablas, está en resultados/preguntas_abiertas.md.</w:t>
       </w:r>
     </w:p>
     <w:p>
@@ -20884,7 +20884,7 @@
           <w:color w:val="000000"/>
           <w:sz w:val="24"/>
         </w:rPr>
-        <w:t xml:space="preserve"> (2 Bs cada uno, params.py).</w:t>
+        <w:t xml:space="preserve"> (2 Bs cada uno, integracion/params.py).</w:t>
       </w:r>
     </w:p>
     <w:p>
@@ -20938,7 +20938,7 @@
           <w:color w:val="000000"/>
           <w:sz w:val="24"/>
         </w:rPr>
-        <w:t>α es el parámetro más delicado: no cambia el precio de equilibrio, pero el valor nominal está a un 14 % del límite de inestabilidad; con la mitad de α el precio llega al equilibrio sin oscilar (pregunta 1).</w:t>
+        <w:t>α es el parámetro más delicado: no cambia el precio de equilibrio, pero el valor nominal está tan cerca del límite que subirlo un 14 % lo vuelve inestable; con la mitad de α el precio llega al equilibrio sin oscilar (pregunta 1).</w:t>
       </w:r>
     </w:p>
     <w:p>
@@ -22906,6 +22906,48 @@
                 <w:sz w:val="24"/>
               </w:rPr>
               <w:t>redactado a partir de integracion/decision.py</w:t>
+            </w:r>
+          </w:p>
+        </w:tc>
+      </w:tr>
+      <w:tr>
+        <w:tc>
+          <w:tcPr>
+            <w:tcW w:type="dxa" w:w="4561"/>
+          </w:tcPr>
+          <w:p>
+            <w:pPr>
+              <w:spacing w:line="240" w:lineRule="auto" w:after="0"/>
+              <w:jc w:val="center"/>
+            </w:pPr>
+            <w:r>
+              <w:rPr>
+                <w:rFonts w:ascii="Times New Roman" w:hAnsi="Times New Roman" w:eastAsia="Times New Roman"/>
+                <w:b w:val="0"/>
+                <w:color w:val="000000"/>
+                <w:sz w:val="24"/>
+              </w:rPr>
+              <w:t>resultados/preguntas_abiertas.md</w:t>
+            </w:r>
+          </w:p>
+        </w:tc>
+        <w:tc>
+          <w:tcPr>
+            <w:tcW w:type="dxa" w:w="4561"/>
+          </w:tcPr>
+          <w:p>
+            <w:pPr>
+              <w:spacing w:line="240" w:lineRule="auto" w:after="0"/>
+              <w:jc w:val="center"/>
+            </w:pPr>
+            <w:r>
+              <w:rPr>
+                <w:rFonts w:ascii="Times New Roman" w:hAnsi="Times New Roman" w:eastAsia="Times New Roman"/>
+                <w:b w:val="0"/>
+                <w:color w:val="000000"/>
+                <w:sz w:val="24"/>
+              </w:rPr>
+              <w:t>resumen redactado de la sección 7</w:t>
             </w:r>
           </w:p>
         </w:tc>

</xml_diff>